<commit_message>
Update Design a database for YB college.docx
</commit_message>
<xml_diff>
--- a/Design a database for YB college.docx
+++ b/Design a database for YB college.docx
@@ -33,15 +33,7 @@
         <w:t xml:space="preserve"> </w:t>
       </w:r>
       <w:r>
-        <w:t xml:space="preserve">story that defines the purpose and scope of the database. Describe the main entities (e.g., students, lecturers, </w:t>
-      </w:r>
-      <w:proofErr w:type="spellStart"/>
-      <w:r>
-        <w:t>etc</w:t>
-      </w:r>
-      <w:proofErr w:type="spellEnd"/>
-      <w:r>
-        <w:t>).</w:t>
+        <w:t>story that defines the purpose and scope of the database. Describe the main entities (e.g., students, lecturers, etc).</w:t>
       </w:r>
     </w:p>
     <w:p>
@@ -107,10 +99,13 @@
         <w:ind w:left="720"/>
       </w:pPr>
       <w:r>
-        <w:t xml:space="preserve">The database needs </w:t>
-      </w:r>
-      <w:r>
-        <w:t>to cover various aspects of the master's program, from student enrollment to course management and fee tracking. </w:t>
+        <w:t xml:space="preserve">The database </w:t>
+      </w:r>
+      <w:r>
+        <w:t xml:space="preserve">will </w:t>
+      </w:r>
+      <w:r>
+        <w:t>cover various aspects of the master's program, from student enrollment to course management and fee tracking. </w:t>
       </w:r>
     </w:p>
     <w:p>
@@ -400,15 +395,7 @@
       </w:r>
       <w:r>
         <w:br/>
-        <w:t xml:space="preserve">List all entities with brief descriptions of their roles and attributes (e.g., Student, Course, Class, Lecturer, </w:t>
-      </w:r>
-      <w:proofErr w:type="spellStart"/>
-      <w:r>
-        <w:t>etc</w:t>
-      </w:r>
-      <w:proofErr w:type="spellEnd"/>
-      <w:r>
-        <w:t>).</w:t>
+        <w:t>List all entities with brief descriptions of their roles and attributes (e.g., Student, Course, Class, Lecturer, etc).</w:t>
       </w:r>
     </w:p>
     <w:p>

</xml_diff>